<commit_message>
updated the reports for weeks 5 and 6
</commit_message>
<xml_diff>
--- a/UniFlow_Week6_Progress_Report.docx
+++ b/UniFlow_Week6_Progress_Report.docx
@@ -3,12 +3,21 @@
 <w:document xmlns:wpc="http://schemas.microsoft.com/office/word/2010/wordprocessingCanvas" xmlns:cx="http://schemas.microsoft.com/office/drawing/2014/chartex" xmlns:cx1="http://schemas.microsoft.com/office/drawing/2015/9/8/chartex" xmlns:cx2="http://schemas.microsoft.com/office/drawing/2015/10/21/chartex" xmlns:cx3="http://schemas.microsoft.com/office/drawing/2016/5/9/chartex" xmlns:cx4="http://schemas.microsoft.com/office/drawing/2016/5/10/chartex" xmlns:cx5="http://schemas.microsoft.com/office/drawing/2016/5/11/chartex" xmlns:cx6="http://schemas.microsoft.com/office/drawing/2016/5/12/chartex" xmlns:cx7="http://schemas.microsoft.com/office/drawing/2016/5/13/chartex" xmlns:cx8="http://schemas.microsoft.com/office/drawing/2016/5/14/chartex" xmlns:mc="http://schemas.openxmlformats.org/markup-compatibility/2006" xmlns:aink="http://schemas.microsoft.com/office/drawing/2016/ink" xmlns:am3d="http://schemas.microsoft.com/office/drawing/2017/model3d" xmlns:o="urn:schemas-microsoft-com:office:office" xmlns:oel="http://schemas.microsoft.com/office/2019/extlst" xmlns:r="http://schemas.openxmlformats.org/officeDocument/2006/relationships" xmlns:m="http://schemas.openxmlformats.org/officeDocument/2006/math" xmlns:v="urn:schemas-microsoft-com:vml" xmlns:wp14="http://schemas.microsoft.com/office/word/2010/wordprocessingDrawing" xmlns:wp="http://schemas.openxmlformats.org/drawingml/2006/wordprocessingDrawing" xmlns:w10="urn:schemas-microsoft-com:office:word" xmlns:w="http://schemas.openxmlformats.org/wordprocessingml/2006/main" xmlns:w14="http://schemas.microsoft.com/office/word/2010/wordml" xmlns:w15="http://schemas.microsoft.com/office/word/2012/wordml" xmlns:w16cex="http://schemas.microsoft.com/office/word/2018/wordml/cex" xmlns:w16cid="http://schemas.microsoft.com/office/word/2016/wordml/cid" xmlns:w16="http://schemas.microsoft.com/office/word/2018/wordml" xmlns:w16du="http://schemas.microsoft.com/office/word/2023/wordml/word16du" xmlns:w16sdtdh="http://schemas.microsoft.com/office/word/2020/wordml/sdtdatahash" xmlns:w16sdtfl="http://schemas.microsoft.com/office/word/2024/wordml/sdtformatlock" xmlns:w16se="http://schemas.microsoft.com/office/word/2015/wordml/symex" xmlns:wpg="http://schemas.microsoft.com/office/word/2010/wordprocessingGroup" xmlns:wpi="http://schemas.microsoft.com/office/word/2010/wordprocessingInk" xmlns:wne="http://schemas.microsoft.com/office/word/2006/wordml" xmlns:wps="http://schemas.microsoft.com/office/word/2010/wordprocessingShape" mc:Ignorable="w14 w15 w16se w16cid w16 w16cex w16sdtdh w16sdtfl w16du wp14">
   <w:body>
     <w:p>
+      <w:proofErr w:type="spellStart"/>
       <w:r>
         <w:rPr>
           <w:b/>
           <w:sz w:val="36"/>
         </w:rPr>
-        <w:t>UniFlow — Week 6 Progress Report</w:t>
+        <w:t>UniFlow</w:t>
+      </w:r>
+      <w:proofErr w:type="spellEnd"/>
+      <w:r>
+        <w:rPr>
+          <w:b/>
+          <w:sz w:val="36"/>
+        </w:rPr>
+        <w:t xml:space="preserve"> — Week 6 Progress Report</w:t>
       </w:r>
     </w:p>
     <w:p>
@@ -37,7 +46,23 @@
         <w:spacing w:after="120"/>
       </w:pPr>
       <w:r>
-        <w:t>Yohana Mahamat Abdelrassoul (Project/Requirements Lead) · Swale Sebabe Abdu (AI/Agent Lead) · Okello Emmanuel Odongo (Backend/System Lead) · Ainebyona Alvin Police (QA/Testing &amp; Documentation Lead).</w:t>
+        <w:t xml:space="preserve">Yohana Mahamat </w:t>
+      </w:r>
+      <w:proofErr w:type="spellStart"/>
+      <w:r>
+        <w:t>Abdelrassoul</w:t>
+      </w:r>
+      <w:proofErr w:type="spellEnd"/>
+      <w:r>
+        <w:t xml:space="preserve"> (Project/Requirements Lead) · Swale </w:t>
+      </w:r>
+      <w:proofErr w:type="spellStart"/>
+      <w:r>
+        <w:t>Sebabe</w:t>
+      </w:r>
+      <w:proofErr w:type="spellEnd"/>
+      <w:r>
+        <w:t xml:space="preserve"> Abdu (AI/Agent Lead) · Okello Emmanuel Odongo (Backend/System Lead) · Ainebyona Alvin Police (QA/Testing &amp; Documentation Lead).</w:t>
       </w:r>
     </w:p>
     <w:p>
@@ -57,7 +82,15 @@
         <w:spacing w:after="120"/>
       </w:pPr>
       <w:r>
-        <w:t>Make the workflow state explicit, retain only justified memory, and connect capabilities through clear interfaces. Building directly on Week 5's own stated plan: formalize the SessionState the agent loop already had informally, add exactly one justified persistent-memory use case, and specify one capability as an MCP-style interface rather than take on a new live external dependency.</w:t>
+        <w:t xml:space="preserve">Make the workflow state explicit, retain only justified memory, and connect capabilities through clear interfaces. Building directly on Week 5's own stated plan: formalize the </w:t>
+      </w:r>
+      <w:proofErr w:type="spellStart"/>
+      <w:r>
+        <w:t>SessionState</w:t>
+      </w:r>
+      <w:proofErr w:type="spellEnd"/>
+      <w:r>
+        <w:t xml:space="preserve"> the agent loop already had informally, add exactly one justified persistent-memory use case, and specify one capability as an MCP-style interface rather than take on a new live external dependency.</w:t>
       </w:r>
     </w:p>
     <w:p>
@@ -83,8 +116,77 @@
         </w:rPr>
         <w:t xml:space="preserve">State model — </w:t>
       </w:r>
-      <w:r>
-        <w:t>src/tool_baseline.py's four loose local variables (steps, tool_results, model_calls, final) replaced with an explicit SessionState dataclass (request, rounds/steps, status, started_at, ended_at). Same-behaviour refactor, not a new capability — confirmed by all 28 pre-existing tests passing unchanged against the refactored code. Documented in docs/Week6_State_Model.md, which draws the required distinction between this (ephemeral, one request) and the new persistent memory below (survives across requests).</w:t>
+      <w:proofErr w:type="spellStart"/>
+      <w:r>
+        <w:t>src</w:t>
+      </w:r>
+      <w:proofErr w:type="spellEnd"/>
+      <w:r>
+        <w:t>/</w:t>
+      </w:r>
+      <w:proofErr w:type="spellStart"/>
+      <w:r>
+        <w:t>tool_baseline.py's</w:t>
+      </w:r>
+      <w:proofErr w:type="spellEnd"/>
+      <w:r>
+        <w:t xml:space="preserve"> four loose local variables (steps, </w:t>
+      </w:r>
+      <w:proofErr w:type="spellStart"/>
+      <w:r>
+        <w:t>tool_results</w:t>
+      </w:r>
+      <w:proofErr w:type="spellEnd"/>
+      <w:r>
+        <w:t xml:space="preserve">, </w:t>
+      </w:r>
+      <w:proofErr w:type="spellStart"/>
+      <w:r>
+        <w:t>model_calls</w:t>
+      </w:r>
+      <w:proofErr w:type="spellEnd"/>
+      <w:r>
+        <w:t xml:space="preserve">, final) replaced with an explicit </w:t>
+      </w:r>
+      <w:proofErr w:type="spellStart"/>
+      <w:r>
+        <w:t>SessionState</w:t>
+      </w:r>
+      <w:proofErr w:type="spellEnd"/>
+      <w:r>
+        <w:t xml:space="preserve"> </w:t>
+      </w:r>
+      <w:proofErr w:type="spellStart"/>
+      <w:r>
+        <w:t>dataclass</w:t>
+      </w:r>
+      <w:proofErr w:type="spellEnd"/>
+      <w:r>
+        <w:t xml:space="preserve"> (request, rounds/steps, status, </w:t>
+      </w:r>
+      <w:proofErr w:type="spellStart"/>
+      <w:r>
+        <w:t>started_at</w:t>
+      </w:r>
+      <w:proofErr w:type="spellEnd"/>
+      <w:r>
+        <w:t xml:space="preserve">, </w:t>
+      </w:r>
+      <w:proofErr w:type="spellStart"/>
+      <w:r>
+        <w:t>ended_at</w:t>
+      </w:r>
+      <w:proofErr w:type="spellEnd"/>
+      <w:r>
+        <w:t>). Same-</w:t>
+      </w:r>
+      <w:proofErr w:type="spellStart"/>
+      <w:r>
+        <w:t>behaviour</w:t>
+      </w:r>
+      <w:proofErr w:type="spellEnd"/>
+      <w:r>
+        <w:t xml:space="preserve"> refactor, not a new capability — confirmed by all 28 pre-existing tests passing unchanged against the refactored code. Documented in docs/Week6_State_Model.md, which draws the required distinction between this (ephemeral, one request) and the new persistent memory below (survives across requests).</w:t>
       </w:r>
     </w:p>
     <w:p>
@@ -99,7 +201,95 @@
         <w:t xml:space="preserve">Persistent memory — </w:t>
       </w:r>
       <w:r>
-        <w:t>src/memory/case_history.py (find_prior_defect / remember_defect / forget) wired into src/tools/dispatch.py's create_defect_report path only. A repeated (rule_id, story_id) violation returns the existing defect_id with duplicate_of set instead of writing a near-duplicate pending_review file. check_course_load and rule enforcement are completely unaffected — memory only deduplicates the write, never the detection. Documented in docs/Week6_Memory_Design.md (what/why/who/retention and deletion, plus an explicit “what memory does NOT do” section).</w:t>
+        <w:t>src/memory/case_history.py (</w:t>
+      </w:r>
+      <w:proofErr w:type="spellStart"/>
+      <w:r>
+        <w:t>find_prior_defect</w:t>
+      </w:r>
+      <w:proofErr w:type="spellEnd"/>
+      <w:r>
+        <w:t xml:space="preserve"> / </w:t>
+      </w:r>
+      <w:proofErr w:type="spellStart"/>
+      <w:r>
+        <w:t>remember_defect</w:t>
+      </w:r>
+      <w:proofErr w:type="spellEnd"/>
+      <w:r>
+        <w:t xml:space="preserve"> / forget) wired into </w:t>
+      </w:r>
+      <w:proofErr w:type="spellStart"/>
+      <w:r>
+        <w:t>src</w:t>
+      </w:r>
+      <w:proofErr w:type="spellEnd"/>
+      <w:r>
+        <w:t>/tools/</w:t>
+      </w:r>
+      <w:proofErr w:type="spellStart"/>
+      <w:r>
+        <w:t>dispatch.py's</w:t>
+      </w:r>
+      <w:proofErr w:type="spellEnd"/>
+      <w:r>
+        <w:t xml:space="preserve"> </w:t>
+      </w:r>
+      <w:proofErr w:type="spellStart"/>
+      <w:r>
+        <w:t>create_defect_report</w:t>
+      </w:r>
+      <w:proofErr w:type="spellEnd"/>
+      <w:r>
+        <w:t xml:space="preserve"> path only. A repeated (</w:t>
+      </w:r>
+      <w:proofErr w:type="spellStart"/>
+      <w:r>
+        <w:t>rule_id</w:t>
+      </w:r>
+      <w:proofErr w:type="spellEnd"/>
+      <w:r>
+        <w:t xml:space="preserve">, </w:t>
+      </w:r>
+      <w:proofErr w:type="spellStart"/>
+      <w:r>
+        <w:t>story_id</w:t>
+      </w:r>
+      <w:proofErr w:type="spellEnd"/>
+      <w:r>
+        <w:t xml:space="preserve">) violation returns the existing </w:t>
+      </w:r>
+      <w:proofErr w:type="spellStart"/>
+      <w:r>
+        <w:t>defect_id</w:t>
+      </w:r>
+      <w:proofErr w:type="spellEnd"/>
+      <w:r>
+        <w:t xml:space="preserve"> with </w:t>
+      </w:r>
+      <w:proofErr w:type="spellStart"/>
+      <w:r>
+        <w:t>duplicate_of</w:t>
+      </w:r>
+      <w:proofErr w:type="spellEnd"/>
+      <w:r>
+        <w:t xml:space="preserve"> set instead of writing a near-duplicate </w:t>
+      </w:r>
+      <w:proofErr w:type="spellStart"/>
+      <w:r>
+        <w:t>pending_review</w:t>
+      </w:r>
+      <w:proofErr w:type="spellEnd"/>
+      <w:r>
+        <w:t xml:space="preserve"> file. </w:t>
+      </w:r>
+      <w:proofErr w:type="spellStart"/>
+      <w:r>
+        <w:t>check_course_load</w:t>
+      </w:r>
+      <w:proofErr w:type="spellEnd"/>
+      <w:r>
+        <w:t xml:space="preserve"> and rule enforcement are completely unaffected — memory only deduplicates the write, never the detection. Documented in docs/Week6_Memory_Design.md (what/why/who/retention and deletion, plus an explicit “what memory does NOT do” section).</w:t>
       </w:r>
     </w:p>
     <w:p>
@@ -114,7 +304,71 @@
         <w:t xml:space="preserve">Working demonstration — </w:t>
       </w:r>
       <w:r>
-        <w:t>the same request run twice through the real handle_request() -&gt; dispatch() -&gt; create_defect_report -&gt; case_history path. Run 1 writes a new defect and remembers it (times_seen: 1); identical run 2 returns duplicate_of pointing at run 1's defect_id with no new file (times_seen: 2). data/memory/case_history.json is the real, committed persistent evidence.</w:t>
+        <w:t xml:space="preserve">the same request run twice through the real </w:t>
+      </w:r>
+      <w:proofErr w:type="spellStart"/>
+      <w:r>
+        <w:t>handle_request</w:t>
+      </w:r>
+      <w:proofErr w:type="spellEnd"/>
+      <w:r>
+        <w:t xml:space="preserve">() -&gt; dispatch() -&gt; </w:t>
+      </w:r>
+      <w:proofErr w:type="spellStart"/>
+      <w:r>
+        <w:t>create_defect_report</w:t>
+      </w:r>
+      <w:proofErr w:type="spellEnd"/>
+      <w:r>
+        <w:t xml:space="preserve"> -&gt; </w:t>
+      </w:r>
+      <w:proofErr w:type="spellStart"/>
+      <w:r>
+        <w:t>case_history</w:t>
+      </w:r>
+      <w:proofErr w:type="spellEnd"/>
+      <w:r>
+        <w:t xml:space="preserve"> path. Run 1 writes a new defect and remembers it (</w:t>
+      </w:r>
+      <w:proofErr w:type="spellStart"/>
+      <w:r>
+        <w:t>times_seen</w:t>
+      </w:r>
+      <w:proofErr w:type="spellEnd"/>
+      <w:r>
+        <w:t xml:space="preserve">: 1); identical run 2 returns </w:t>
+      </w:r>
+      <w:proofErr w:type="spellStart"/>
+      <w:r>
+        <w:t>duplicate_of</w:t>
+      </w:r>
+      <w:proofErr w:type="spellEnd"/>
+      <w:r>
+        <w:t xml:space="preserve"> pointing at run 1's </w:t>
+      </w:r>
+      <w:proofErr w:type="spellStart"/>
+      <w:r>
+        <w:t>defect_id</w:t>
+      </w:r>
+      <w:proofErr w:type="spellEnd"/>
+      <w:r>
+        <w:t xml:space="preserve"> with no new file (</w:t>
+      </w:r>
+      <w:proofErr w:type="spellStart"/>
+      <w:r>
+        <w:t>times_seen</w:t>
+      </w:r>
+      <w:proofErr w:type="spellEnd"/>
+      <w:r>
+        <w:t>: 2). data/memory/</w:t>
+      </w:r>
+      <w:proofErr w:type="spellStart"/>
+      <w:r>
+        <w:t>case_history.json</w:t>
+      </w:r>
+      <w:proofErr w:type="spellEnd"/>
+      <w:r>
+        <w:t xml:space="preserve"> is the real, committed persistent evidence.</w:t>
       </w:r>
     </w:p>
     <w:p>
@@ -129,7 +383,23 @@
         <w:t xml:space="preserve">MCP-style interface specification — </w:t>
       </w:r>
       <w:r>
-        <w:t xml:space="preserve">docs/Week6_MCP_Interface.md documents check_course_load as it would be exposed by a UniFlow MCP server (capability, input/output schema, permissions, security boundary), reusing the Week 4 Tool Catalogue's schemas unchanged. A live external integration was considered and not built — see </w:t>
+        <w:t xml:space="preserve">docs/Week6_MCP_Interface.md documents </w:t>
+      </w:r>
+      <w:proofErr w:type="spellStart"/>
+      <w:r>
+        <w:t>check_course_load</w:t>
+      </w:r>
+      <w:proofErr w:type="spellEnd"/>
+      <w:r>
+        <w:t xml:space="preserve"> as it would be exposed by a </w:t>
+      </w:r>
+      <w:proofErr w:type="spellStart"/>
+      <w:r>
+        <w:t>UniFlow</w:t>
+      </w:r>
+      <w:proofErr w:type="spellEnd"/>
+      <w:r>
+        <w:t xml:space="preserve"> MCP server (capability, input/output schema, permissions, security boundary), reusing the Week 4 Tool Catalogue's schemas unchanged. A live external integration was considered and not built — see </w:t>
       </w:r>
       <w:r>
         <w:t xml:space="preserve">Chapter </w:t>
@@ -150,7 +420,15 @@
         <w:t xml:space="preserve">Architecture diagram — </w:t>
       </w:r>
       <w:r>
-        <w:t>a fourth “Week N addition” section appended to docs/Week3_RAG_Architecture.md (same file extended every week since Week 4): a state-vs-memory flowchart and a Week 6 file map.</w:t>
+        <w:t xml:space="preserve">a fourth “Week </w:t>
+      </w:r>
+      <w:proofErr w:type="spellStart"/>
+      <w:r>
+        <w:t>N</w:t>
+      </w:r>
+      <w:proofErr w:type="spellEnd"/>
+      <w:r>
+        <w:t xml:space="preserve"> addition” section appended to docs/Week3_RAG_Architecture.md (same file extended every week since Week 4): a state-vs-memory flowchart and a Week 6 file map.</w:t>
       </w:r>
     </w:p>
     <w:p>
@@ -185,7 +463,23 @@
         <w:spacing w:after="120"/>
       </w:pPr>
       <w:r>
-        <w:t>All 39 tests pass. The two-trace demonstration behaved exactly as designed: first detection writes DEF-20261008T130552 (status pending_review); the identical second request returns duplicate_of: "DEF-20261008T130552" and writes nothing new. No live model call was available in this development environment (no .env / API key configured), so both demonstration traces use scripted model turns driving the real dispatch/memory code — labelled as such, not claimed as live evidence (see §7).</w:t>
+        <w:t xml:space="preserve">All 39 tests pass. The two-trace demonstration behaved exactly as designed: first detection writes DEF-20261008T130552 (status </w:t>
+      </w:r>
+      <w:proofErr w:type="spellStart"/>
+      <w:r>
+        <w:t>pending_review</w:t>
+      </w:r>
+      <w:proofErr w:type="spellEnd"/>
+      <w:r>
+        <w:t xml:space="preserve">); the identical second request returns </w:t>
+      </w:r>
+      <w:proofErr w:type="spellStart"/>
+      <w:r>
+        <w:t>duplicate_of</w:t>
+      </w:r>
+      <w:proofErr w:type="spellEnd"/>
+      <w:r>
+        <w:t>: "DEF-20261008T130552" and writes nothing new. No live model call was available in this development environment (no .env / API key configured), so both demonstration traces use scripted model turns driving the real dispatch/memory code — labelled as such, not claimed as live evidence (see §7).</w:t>
       </w:r>
     </w:p>
     <w:p>
@@ -220,8 +514,45 @@
         </w:rPr>
         <w:t xml:space="preserve">A real latent bug, found by testing: </w:t>
       </w:r>
-      <w:r>
-        <w:t>times_seen only incremented when remember_defect() was called directly; the normal dispatch()-driven duplicate path never called it again, so repeated detections were invisible in the stored count. Fixed by having the duplicate branch call remember_defect() with the existing defect_id, which also keeps last_seen current.</w:t>
+      <w:proofErr w:type="spellStart"/>
+      <w:r>
+        <w:t>times_seen</w:t>
+      </w:r>
+      <w:proofErr w:type="spellEnd"/>
+      <w:r>
+        <w:t xml:space="preserve"> only incremented when </w:t>
+      </w:r>
+      <w:proofErr w:type="spellStart"/>
+      <w:r>
+        <w:t>remember_defect</w:t>
+      </w:r>
+      <w:proofErr w:type="spellEnd"/>
+      <w:r>
+        <w:t xml:space="preserve">() was called directly; the normal dispatch()-driven duplicate path never called it again, so repeated detections were invisible in the stored count. Fixed by having the duplicate branch call </w:t>
+      </w:r>
+      <w:proofErr w:type="spellStart"/>
+      <w:r>
+        <w:t>remember_defect</w:t>
+      </w:r>
+      <w:proofErr w:type="spellEnd"/>
+      <w:r>
+        <w:t xml:space="preserve">() with the existing </w:t>
+      </w:r>
+      <w:proofErr w:type="spellStart"/>
+      <w:r>
+        <w:t>defect_id</w:t>
+      </w:r>
+      <w:proofErr w:type="spellEnd"/>
+      <w:r>
+        <w:t xml:space="preserve">, which also keeps </w:t>
+      </w:r>
+      <w:proofErr w:type="spellStart"/>
+      <w:r>
+        <w:t>last_seen</w:t>
+      </w:r>
+      <w:proofErr w:type="spellEnd"/>
+      <w:r>
+        <w:t xml:space="preserve"> current.</w:t>
       </w:r>
     </w:p>
     <w:p>
@@ -236,7 +567,31 @@
         <w:t xml:space="preserve">A real reproducibility hazard, caught before it caused damage: </w:t>
       </w:r>
       <w:r>
-        <w:t>wiring memory into dispatch() would have silently changed Week 4's already-graded TQ-13 result on any future re-run of eval/tool_eval_cases.json — TQ-13 shares its rule_id/story_id with several other cases in that suite. Fixed by giving src/tool_eval_runner.py its own isolated memory store, reset at the start of every run; confirmed by running TQ-13 twice and checking the result stayed identical both times.</w:t>
+        <w:t>wiring memory into dispatch() would have silently changed Week 4's already-graded TQ-13 result on any future re-run of eval/</w:t>
+      </w:r>
+      <w:proofErr w:type="spellStart"/>
+      <w:r>
+        <w:t>tool_eval_cases.json</w:t>
+      </w:r>
+      <w:proofErr w:type="spellEnd"/>
+      <w:r>
+        <w:t xml:space="preserve"> — TQ-13 shares its </w:t>
+      </w:r>
+      <w:proofErr w:type="spellStart"/>
+      <w:r>
+        <w:t>rule_id</w:t>
+      </w:r>
+      <w:proofErr w:type="spellEnd"/>
+      <w:r>
+        <w:t>/</w:t>
+      </w:r>
+      <w:proofErr w:type="spellStart"/>
+      <w:r>
+        <w:t>story_id</w:t>
+      </w:r>
+      <w:proofErr w:type="spellEnd"/>
+      <w:r>
+        <w:t xml:space="preserve"> with several other cases in that suite. Fixed by giving src/tool_eval_runner.py its own isolated memory store, reset at the start of every run; confirmed by running TQ-13 twice and checking the result stayed identical both times.</w:t>
       </w:r>
     </w:p>
     <w:p>
@@ -271,7 +626,60 @@
         <w:spacing w:after="120"/>
       </w:pPr>
       <w:r>
-        <w:t>Week 6 task ownership: all five deliverables — Ainebyona Alvin Police (drafted ahead of the usual Week 2-4 rotation, same as Week 5; full team review before MUELE submission).</w:t>
+        <w:t xml:space="preserve">Week 6 task ownership: </w:t>
+      </w:r>
+      <w:r>
+        <w:t>State Model-</w:t>
+      </w:r>
+      <w:r>
+        <w:t xml:space="preserve"> Ainebyona Alvin</w:t>
+      </w:r>
+      <w:r>
+        <w:t>;</w:t>
+      </w:r>
+      <w:r>
+        <w:rPr>
+          <w:b/>
+        </w:rPr>
+        <w:t xml:space="preserve"> </w:t>
+      </w:r>
+      <w:r>
+        <w:rPr>
+          <w:bCs/>
+        </w:rPr>
+        <w:t>Working</w:t>
+      </w:r>
+      <w:r>
+        <w:rPr>
+          <w:bCs/>
+        </w:rPr>
+        <w:t xml:space="preserve"> memory</w:t>
+      </w:r>
+      <w:r>
+        <w:rPr>
+          <w:bCs/>
+        </w:rPr>
+        <w:t xml:space="preserve"> -Swale </w:t>
+      </w:r>
+      <w:proofErr w:type="spellStart"/>
+      <w:r>
+        <w:rPr>
+          <w:bCs/>
+        </w:rPr>
+        <w:t>Sebabe</w:t>
+      </w:r>
+      <w:proofErr w:type="spellEnd"/>
+      <w:r>
+        <w:rPr>
+          <w:bCs/>
+        </w:rPr>
+        <w:t>; Memory Design – Yohana Mahamat; MCP-Style Interface specification – Odong Emmanuel; Week 6 progress report - All of us 4</w:t>
+      </w:r>
+      <w:r>
+        <w:t xml:space="preserve"> </w:t>
+      </w:r>
+      <w:r>
+        <w:t>.</w:t>
       </w:r>
     </w:p>
     <w:p>
@@ -279,7 +687,13 @@
         <w:spacing w:after="120"/>
       </w:pPr>
       <w:r>
-        <w:t>GitHub commit link(s): [fill in after committing and pushing this work].</w:t>
+        <w:t>GitHub commit link(s): [</w:t>
+      </w:r>
+      <w:r>
+        <w:t>https://github.com/BSSE-FINAL-YEAR/UniFlow.git</w:t>
+      </w:r>
+      <w:r>
+        <w:t>].</w:t>
       </w:r>
     </w:p>
     <w:p>
@@ -287,7 +701,13 @@
         <w:spacing w:after="120"/>
       </w:pPr>
       <w:r>
-        <w:t>ClickUp board: [same board as Weeks 4-5 — log Week 6 tasks with owners/status and link to the commit].</w:t>
+        <w:t>ClickUp board: [</w:t>
+      </w:r>
+      <w:r>
+        <w:t>https://app.clickup.com/1200410000004069/v/li/1200410000007526</w:t>
+      </w:r>
+      <w:r>
+        <w:t>].</w:t>
       </w:r>
     </w:p>
     <w:p>
@@ -337,7 +757,39 @@
         <w:spacing w:after="120"/>
       </w:pPr>
       <w:r>
-        <w:t xml:space="preserve">Per the capstone brief's own Week 7 scope (“Evaluation, Observability and Guardrails”): build a final evaluation set of at least 30 scenarios (normal, edge, incorrect-information, adversarial, tool-failure and unauthorized-action cases) with measurable criteria (task completion, groundedness, tool selection, instruction following, latency, safety violations); add logs/traces capturing model, prompt, retrieval, tool, latency/error and outcome evidence — largely a consolidation of tracing already in place since Week 2 rather than new infrastructure; implement/evidence guardrails (input/output validation, tool allow-list, authorization, iteration limits, approval controls, prompt-injection awareness) — most already exist (src/tools/registry.py's allow-list, dispatch()'s schema validation, MAX_TOOL_ROUNDS, create_defect_report's authorization-by-omission) and need to be evidenced together rather than built from scratch; and assemble a Failure Catalogue with at least five genuine failures and re-test evidence after fixes, drawing on this week's own </w:t>
+        <w:t xml:space="preserve">Per the capstone brief's own Week 7 scope (“Evaluation, Observability and Guardrails”): build a final evaluation set of at least 30 scenarios (normal, edge, incorrect-information, adversarial, tool-failure and unauthorized-action cases) with measurable criteria (task completion, </w:t>
+      </w:r>
+      <w:proofErr w:type="spellStart"/>
+      <w:r>
+        <w:t>groundedness</w:t>
+      </w:r>
+      <w:proofErr w:type="spellEnd"/>
+      <w:r>
+        <w:t>, tool selection, instruction following, latency, safety violations); add logs/traces capturing model, prompt, retrieval, tool, latency/error and outcome evidence — largely a consolidation of tracing already in place since Week 2 rather than new infrastructure; implement/evidence guardrails (input/output validation, tool allow-list, authorization, iteration limits, approval controls, prompt-injection awareness) — most already exist (</w:t>
+      </w:r>
+      <w:proofErr w:type="spellStart"/>
+      <w:r>
+        <w:t>src</w:t>
+      </w:r>
+      <w:proofErr w:type="spellEnd"/>
+      <w:r>
+        <w:t>/tools/</w:t>
+      </w:r>
+      <w:proofErr w:type="spellStart"/>
+      <w:r>
+        <w:t>registry.py's</w:t>
+      </w:r>
+      <w:proofErr w:type="spellEnd"/>
+      <w:r>
+        <w:t xml:space="preserve"> allow-list, dispatch()'s schema validation, MAX_TOOL_ROUNDS, </w:t>
+      </w:r>
+      <w:proofErr w:type="spellStart"/>
+      <w:r>
+        <w:t>create_defect_report's</w:t>
+      </w:r>
+      <w:proofErr w:type="spellEnd"/>
+      <w:r>
+        <w:t xml:space="preserve"> authorization-by-omission) and need to be evidenced together rather than built from scratch; and assemble a Failure Catalogue with at least five genuine failures and re-test evidence after fixes, drawing on this week's own </w:t>
       </w:r>
       <w:r>
         <w:t xml:space="preserve">Chapter </w:t>

</xml_diff>